<commit_message>
cập nhật code hiển thị thông báo + doc mục 2.activity diagram
</commit_message>
<xml_diff>
--- a/docs/2. Activity Diagram.docx
+++ b/docs/2. Activity Diagram.docx
@@ -584,6 +584,7 @@
         <w:rPr>
           <w:b/>
           <w:bCs/>
+          <w:noProof/>
         </w:rPr>
       </w:pPr>
       <w:r>
@@ -607,16 +608,42 @@
         </w:rPr>
         <w:t xml:space="preserve">Diagram </w:t>
       </w:r>
-      <w:r>
-        <w:rPr>
-          <w:b/>
-          <w:bCs/>
+    </w:p>
+    <w:p>
+      <w:pPr>
+        <w:spacing w:line="240" w:lineRule="auto"/>
+        <w:rPr>
+          <w:b/>
+          <w:bCs/>
+          <w:noProof/>
+        </w:rPr>
+      </w:pPr>
+      <w:r>
+        <w:rPr>
+          <w:b/>
+          <w:bCs/>
+          <w:noProof/>
+        </w:rPr>
+        <w:t>* Case 1 : Create a new book</w:t>
+      </w:r>
+    </w:p>
+    <w:p>
+      <w:pPr>
+        <w:spacing w:line="240" w:lineRule="auto"/>
+        <w:rPr>
+          <w:b/>
+          <w:bCs/>
+        </w:rPr>
+      </w:pPr>
+      <w:r>
+        <w:rPr>
+          <w:noProof/>
         </w:rPr>
         <w:drawing>
-          <wp:inline distT="0" distB="0" distL="0" distR="0" wp14:anchorId="4479E703" wp14:editId="71722597">
-            <wp:extent cx="5943600" cy="3308350"/>
-            <wp:effectExtent l="0" t="0" r="0" b="6350"/>
-            <wp:docPr id="367525307" name="Hình ảnh 1"/>
+          <wp:inline distT="0" distB="0" distL="0" distR="0" wp14:anchorId="77C91213" wp14:editId="21A64960">
+            <wp:extent cx="5943600" cy="4069080"/>
+            <wp:effectExtent l="0" t="0" r="0" b="7620"/>
+            <wp:docPr id="2000487888" name="Hình ảnh 1"/>
             <wp:cNvGraphicFramePr>
               <a:graphicFrameLocks xmlns:a="http://schemas.openxmlformats.org/drawingml/2006/main" noChangeAspect="1"/>
             </wp:cNvGraphicFramePr>
@@ -624,7 +651,7 @@
               <a:graphicData uri="http://schemas.openxmlformats.org/drawingml/2006/picture">
                 <pic:pic xmlns:pic="http://schemas.openxmlformats.org/drawingml/2006/picture">
                   <pic:nvPicPr>
-                    <pic:cNvPr id="367525307" name=""/>
+                    <pic:cNvPr id="2000487888" name=""/>
                     <pic:cNvPicPr/>
                   </pic:nvPicPr>
                   <pic:blipFill>
@@ -636,7 +663,7 @@
                   <pic:spPr>
                     <a:xfrm>
                       <a:off x="0" y="0"/>
-                      <a:ext cx="5943600" cy="3308350"/>
+                      <a:ext cx="5943600" cy="4069080"/>
                     </a:xfrm>
                     <a:prstGeom prst="rect">
                       <a:avLst/>
@@ -649,7 +676,355 @@
         </w:drawing>
       </w:r>
     </w:p>
-    <w:p/>
+    <w:p>
+      <w:pPr>
+        <w:spacing w:line="240" w:lineRule="auto"/>
+        <w:rPr>
+          <w:b/>
+          <w:bCs/>
+          <w:noProof/>
+        </w:rPr>
+      </w:pPr>
+    </w:p>
+    <w:p>
+      <w:pPr>
+        <w:spacing w:line="240" w:lineRule="auto"/>
+        <w:rPr>
+          <w:b/>
+          <w:bCs/>
+          <w:noProof/>
+        </w:rPr>
+      </w:pPr>
+    </w:p>
+    <w:p>
+      <w:pPr>
+        <w:spacing w:line="240" w:lineRule="auto"/>
+        <w:rPr>
+          <w:b/>
+          <w:bCs/>
+          <w:noProof/>
+        </w:rPr>
+      </w:pPr>
+    </w:p>
+    <w:p>
+      <w:pPr>
+        <w:spacing w:line="240" w:lineRule="auto"/>
+        <w:rPr>
+          <w:b/>
+          <w:bCs/>
+          <w:noProof/>
+        </w:rPr>
+      </w:pPr>
+    </w:p>
+    <w:p>
+      <w:pPr>
+        <w:spacing w:line="240" w:lineRule="auto"/>
+        <w:rPr>
+          <w:b/>
+          <w:bCs/>
+          <w:noProof/>
+        </w:rPr>
+      </w:pPr>
+    </w:p>
+    <w:p>
+      <w:pPr>
+        <w:tabs>
+          <w:tab w:val="num" w:pos="720"/>
+        </w:tabs>
+        <w:spacing w:line="240" w:lineRule="auto"/>
+        <w:rPr>
+          <w:b/>
+          <w:bCs/>
+          <w:noProof/>
+        </w:rPr>
+      </w:pPr>
+    </w:p>
+    <w:p>
+      <w:pPr>
+        <w:tabs>
+          <w:tab w:val="num" w:pos="720"/>
+        </w:tabs>
+        <w:spacing w:line="240" w:lineRule="auto"/>
+      </w:pPr>
+      <w:r>
+        <w:rPr>
+          <w:b/>
+          <w:bCs/>
+          <w:noProof/>
+        </w:rPr>
+        <w:lastRenderedPageBreak/>
+        <w:t xml:space="preserve">* Case </w:t>
+      </w:r>
+      <w:r>
+        <w:rPr>
+          <w:b/>
+          <w:bCs/>
+          <w:noProof/>
+        </w:rPr>
+        <w:t>2</w:t>
+      </w:r>
+      <w:r>
+        <w:rPr>
+          <w:b/>
+          <w:bCs/>
+          <w:noProof/>
+        </w:rPr>
+        <w:t xml:space="preserve"> : </w:t>
+      </w:r>
+      <w:r>
+        <w:rPr>
+          <w:b/>
+          <w:bCs/>
+        </w:rPr>
+        <w:t>Update an existing book</w:t>
+      </w:r>
+      <w:r>
+        <w:t xml:space="preserve"> </w:t>
+      </w:r>
+    </w:p>
+    <w:p>
+      <w:pPr>
+        <w:spacing w:line="240" w:lineRule="auto"/>
+        <w:rPr>
+          <w:b/>
+          <w:bCs/>
+          <w:noProof/>
+        </w:rPr>
+      </w:pPr>
+      <w:r>
+        <w:rPr>
+          <w:noProof/>
+        </w:rPr>
+        <w:drawing>
+          <wp:inline distT="0" distB="0" distL="0" distR="0" wp14:anchorId="1F4777C2" wp14:editId="13740BB2">
+            <wp:extent cx="5383909" cy="3413760"/>
+            <wp:effectExtent l="0" t="0" r="7620" b="0"/>
+            <wp:docPr id="1750715237" name="Hình ảnh 1"/>
+            <wp:cNvGraphicFramePr>
+              <a:graphicFrameLocks xmlns:a="http://schemas.openxmlformats.org/drawingml/2006/main" noChangeAspect="1"/>
+            </wp:cNvGraphicFramePr>
+            <a:graphic xmlns:a="http://schemas.openxmlformats.org/drawingml/2006/main">
+              <a:graphicData uri="http://schemas.openxmlformats.org/drawingml/2006/picture">
+                <pic:pic xmlns:pic="http://schemas.openxmlformats.org/drawingml/2006/picture">
+                  <pic:nvPicPr>
+                    <pic:cNvPr id="1750715237" name=""/>
+                    <pic:cNvPicPr/>
+                  </pic:nvPicPr>
+                  <pic:blipFill>
+                    <a:blip r:embed="rId7"/>
+                    <a:stretch>
+                      <a:fillRect/>
+                    </a:stretch>
+                  </pic:blipFill>
+                  <pic:spPr>
+                    <a:xfrm>
+                      <a:off x="0" y="0"/>
+                      <a:ext cx="5393581" cy="3419892"/>
+                    </a:xfrm>
+                    <a:prstGeom prst="rect">
+                      <a:avLst/>
+                    </a:prstGeom>
+                  </pic:spPr>
+                </pic:pic>
+              </a:graphicData>
+            </a:graphic>
+          </wp:inline>
+        </w:drawing>
+      </w:r>
+    </w:p>
+    <w:p>
+      <w:pPr>
+        <w:tabs>
+          <w:tab w:val="num" w:pos="720"/>
+        </w:tabs>
+        <w:spacing w:line="240" w:lineRule="auto"/>
+      </w:pPr>
+      <w:r>
+        <w:rPr>
+          <w:b/>
+          <w:bCs/>
+          <w:noProof/>
+        </w:rPr>
+        <w:t xml:space="preserve">* Case </w:t>
+      </w:r>
+      <w:r>
+        <w:rPr>
+          <w:b/>
+          <w:bCs/>
+          <w:noProof/>
+        </w:rPr>
+        <w:t>3</w:t>
+      </w:r>
+      <w:r>
+        <w:rPr>
+          <w:b/>
+          <w:bCs/>
+          <w:noProof/>
+        </w:rPr>
+        <w:t xml:space="preserve"> : </w:t>
+      </w:r>
+      <w:r>
+        <w:rPr>
+          <w:b/>
+          <w:bCs/>
+        </w:rPr>
+        <w:t>Remove an existing book</w:t>
+      </w:r>
+      <w:r>
+        <w:t xml:space="preserve"> </w:t>
+      </w:r>
+    </w:p>
+    <w:p>
+      <w:pPr>
+        <w:spacing w:line="240" w:lineRule="auto"/>
+        <w:rPr>
+          <w:b/>
+          <w:bCs/>
+          <w:noProof/>
+        </w:rPr>
+      </w:pPr>
+    </w:p>
+    <w:p>
+      <w:r>
+        <w:rPr>
+          <w:noProof/>
+        </w:rPr>
+        <w:drawing>
+          <wp:inline distT="0" distB="0" distL="0" distR="0" wp14:anchorId="2720F21C" wp14:editId="72223C77">
+            <wp:extent cx="5435908" cy="3848100"/>
+            <wp:effectExtent l="0" t="0" r="0" b="0"/>
+            <wp:docPr id="1108324606" name="Hình ảnh 1"/>
+            <wp:cNvGraphicFramePr>
+              <a:graphicFrameLocks xmlns:a="http://schemas.openxmlformats.org/drawingml/2006/main" noChangeAspect="1"/>
+            </wp:cNvGraphicFramePr>
+            <a:graphic xmlns:a="http://schemas.openxmlformats.org/drawingml/2006/main">
+              <a:graphicData uri="http://schemas.openxmlformats.org/drawingml/2006/picture">
+                <pic:pic xmlns:pic="http://schemas.openxmlformats.org/drawingml/2006/picture">
+                  <pic:nvPicPr>
+                    <pic:cNvPr id="1108324606" name=""/>
+                    <pic:cNvPicPr/>
+                  </pic:nvPicPr>
+                  <pic:blipFill>
+                    <a:blip r:embed="rId8"/>
+                    <a:stretch>
+                      <a:fillRect/>
+                    </a:stretch>
+                  </pic:blipFill>
+                  <pic:spPr>
+                    <a:xfrm>
+                      <a:off x="0" y="0"/>
+                      <a:ext cx="5462281" cy="3866770"/>
+                    </a:xfrm>
+                    <a:prstGeom prst="rect">
+                      <a:avLst/>
+                    </a:prstGeom>
+                  </pic:spPr>
+                </pic:pic>
+              </a:graphicData>
+            </a:graphic>
+          </wp:inline>
+        </w:drawing>
+      </w:r>
+    </w:p>
+    <w:p>
+      <w:pPr>
+        <w:tabs>
+          <w:tab w:val="num" w:pos="720"/>
+        </w:tabs>
+        <w:spacing w:line="240" w:lineRule="auto"/>
+      </w:pPr>
+      <w:r>
+        <w:rPr>
+          <w:b/>
+          <w:bCs/>
+          <w:noProof/>
+        </w:rPr>
+        <w:lastRenderedPageBreak/>
+        <w:t xml:space="preserve">* Case </w:t>
+      </w:r>
+      <w:r>
+        <w:rPr>
+          <w:b/>
+          <w:bCs/>
+          <w:noProof/>
+        </w:rPr>
+        <w:t>4</w:t>
+      </w:r>
+      <w:r>
+        <w:rPr>
+          <w:b/>
+          <w:bCs/>
+          <w:noProof/>
+        </w:rPr>
+        <w:t xml:space="preserve"> : </w:t>
+      </w:r>
+      <w:r>
+        <w:rPr>
+          <w:b/>
+          <w:bCs/>
+        </w:rPr>
+        <w:t>Display</w:t>
+      </w:r>
+      <w:r>
+        <w:rPr>
+          <w:b/>
+          <w:bCs/>
+        </w:rPr>
+        <w:t xml:space="preserve"> an existing book</w:t>
+      </w:r>
+      <w:r>
+        <w:t xml:space="preserve"> </w:t>
+      </w:r>
+      <w:r>
+        <w:rPr>
+          <w:b/>
+          <w:bCs/>
+        </w:rPr>
+        <w:t>informatiom</w:t>
+      </w:r>
+    </w:p>
+    <w:p>
+      <w:r>
+        <w:rPr>
+          <w:noProof/>
+        </w:rPr>
+        <w:drawing>
+          <wp:inline distT="0" distB="0" distL="0" distR="0" wp14:anchorId="5C4F9600" wp14:editId="0BABA620">
+            <wp:extent cx="5943600" cy="3072130"/>
+            <wp:effectExtent l="0" t="0" r="0" b="0"/>
+            <wp:docPr id="551696634" name="Hình ảnh 1"/>
+            <wp:cNvGraphicFramePr>
+              <a:graphicFrameLocks xmlns:a="http://schemas.openxmlformats.org/drawingml/2006/main" noChangeAspect="1"/>
+            </wp:cNvGraphicFramePr>
+            <a:graphic xmlns:a="http://schemas.openxmlformats.org/drawingml/2006/main">
+              <a:graphicData uri="http://schemas.openxmlformats.org/drawingml/2006/picture">
+                <pic:pic xmlns:pic="http://schemas.openxmlformats.org/drawingml/2006/picture">
+                  <pic:nvPicPr>
+                    <pic:cNvPr id="551696634" name=""/>
+                    <pic:cNvPicPr/>
+                  </pic:nvPicPr>
+                  <pic:blipFill>
+                    <a:blip r:embed="rId9"/>
+                    <a:stretch>
+                      <a:fillRect/>
+                    </a:stretch>
+                  </pic:blipFill>
+                  <pic:spPr>
+                    <a:xfrm>
+                      <a:off x="0" y="0"/>
+                      <a:ext cx="5943600" cy="3072130"/>
+                    </a:xfrm>
+                    <a:prstGeom prst="rect">
+                      <a:avLst/>
+                    </a:prstGeom>
+                  </pic:spPr>
+                </pic:pic>
+              </a:graphicData>
+            </a:graphic>
+          </wp:inline>
+        </w:drawing>
+      </w:r>
+    </w:p>
     <w:sectPr>
       <w:pgSz w:w="12240" w:h="15840"/>
       <w:pgMar w:top="1440" w:right="1440" w:bottom="1440" w:left="1440" w:header="720" w:footer="720" w:gutter="0"/>
@@ -812,7 +1187,233 @@
     </w:lvl>
   </w:abstractNum>
   <w:abstractNum w:abstractNumId="1" w15:restartNumberingAfterBreak="0">
+    <w:nsid w:val="0F2C48DB"/>
+    <w:multiLevelType w:val="multilevel"/>
+    <w:tmpl w:val="8FB237EE"/>
+    <w:lvl w:ilvl="0">
+      <w:start w:val="1"/>
+      <w:numFmt w:val="decimal"/>
+      <w:lvlText w:val="%1."/>
+      <w:lvlJc w:val="left"/>
+      <w:pPr>
+        <w:tabs>
+          <w:tab w:val="num" w:pos="1080"/>
+        </w:tabs>
+        <w:ind w:left="1080" w:hanging="360"/>
+      </w:pPr>
+    </w:lvl>
+    <w:lvl w:ilvl="1">
+      <w:start w:val="2"/>
+      <w:numFmt w:val="bullet"/>
+      <w:lvlText w:val=""/>
+      <w:lvlJc w:val="left"/>
+      <w:pPr>
+        <w:ind w:left="1800" w:hanging="360"/>
+      </w:pPr>
+      <w:rPr>
+        <w:rFonts w:ascii="Wingdings" w:eastAsiaTheme="minorHAnsi" w:hAnsi="Wingdings" w:cstheme="minorBidi" w:hint="default"/>
+      </w:rPr>
+    </w:lvl>
+    <w:lvl w:ilvl="2" w:tentative="1">
+      <w:start w:val="1"/>
+      <w:numFmt w:val="decimal"/>
+      <w:lvlText w:val="%3."/>
+      <w:lvlJc w:val="left"/>
+      <w:pPr>
+        <w:tabs>
+          <w:tab w:val="num" w:pos="2520"/>
+        </w:tabs>
+        <w:ind w:left="2520" w:hanging="360"/>
+      </w:pPr>
+    </w:lvl>
+    <w:lvl w:ilvl="3" w:tentative="1">
+      <w:start w:val="1"/>
+      <w:numFmt w:val="decimal"/>
+      <w:lvlText w:val="%4."/>
+      <w:lvlJc w:val="left"/>
+      <w:pPr>
+        <w:tabs>
+          <w:tab w:val="num" w:pos="3240"/>
+        </w:tabs>
+        <w:ind w:left="3240" w:hanging="360"/>
+      </w:pPr>
+    </w:lvl>
+    <w:lvl w:ilvl="4" w:tentative="1">
+      <w:start w:val="1"/>
+      <w:numFmt w:val="decimal"/>
+      <w:lvlText w:val="%5."/>
+      <w:lvlJc w:val="left"/>
+      <w:pPr>
+        <w:tabs>
+          <w:tab w:val="num" w:pos="3960"/>
+        </w:tabs>
+        <w:ind w:left="3960" w:hanging="360"/>
+      </w:pPr>
+    </w:lvl>
+    <w:lvl w:ilvl="5" w:tentative="1">
+      <w:start w:val="1"/>
+      <w:numFmt w:val="decimal"/>
+      <w:lvlText w:val="%6."/>
+      <w:lvlJc w:val="left"/>
+      <w:pPr>
+        <w:tabs>
+          <w:tab w:val="num" w:pos="4680"/>
+        </w:tabs>
+        <w:ind w:left="4680" w:hanging="360"/>
+      </w:pPr>
+    </w:lvl>
+    <w:lvl w:ilvl="6" w:tentative="1">
+      <w:start w:val="1"/>
+      <w:numFmt w:val="decimal"/>
+      <w:lvlText w:val="%7."/>
+      <w:lvlJc w:val="left"/>
+      <w:pPr>
+        <w:tabs>
+          <w:tab w:val="num" w:pos="5400"/>
+        </w:tabs>
+        <w:ind w:left="5400" w:hanging="360"/>
+      </w:pPr>
+    </w:lvl>
+    <w:lvl w:ilvl="7" w:tentative="1">
+      <w:start w:val="1"/>
+      <w:numFmt w:val="decimal"/>
+      <w:lvlText w:val="%8."/>
+      <w:lvlJc w:val="left"/>
+      <w:pPr>
+        <w:tabs>
+          <w:tab w:val="num" w:pos="6120"/>
+        </w:tabs>
+        <w:ind w:left="6120" w:hanging="360"/>
+      </w:pPr>
+    </w:lvl>
+    <w:lvl w:ilvl="8" w:tentative="1">
+      <w:start w:val="1"/>
+      <w:numFmt w:val="decimal"/>
+      <w:lvlText w:val="%9."/>
+      <w:lvlJc w:val="left"/>
+      <w:pPr>
+        <w:tabs>
+          <w:tab w:val="num" w:pos="6840"/>
+        </w:tabs>
+        <w:ind w:left="6840" w:hanging="360"/>
+      </w:pPr>
+    </w:lvl>
+  </w:abstractNum>
+  <w:abstractNum w:abstractNumId="2" w15:restartNumberingAfterBreak="0">
     <w:nsid w:val="28AA3B43"/>
+    <w:multiLevelType w:val="multilevel"/>
+    <w:tmpl w:val="8FB237EE"/>
+    <w:lvl w:ilvl="0">
+      <w:start w:val="1"/>
+      <w:numFmt w:val="decimal"/>
+      <w:lvlText w:val="%1."/>
+      <w:lvlJc w:val="left"/>
+      <w:pPr>
+        <w:tabs>
+          <w:tab w:val="num" w:pos="1080"/>
+        </w:tabs>
+        <w:ind w:left="1080" w:hanging="360"/>
+      </w:pPr>
+    </w:lvl>
+    <w:lvl w:ilvl="1">
+      <w:start w:val="2"/>
+      <w:numFmt w:val="bullet"/>
+      <w:lvlText w:val=""/>
+      <w:lvlJc w:val="left"/>
+      <w:pPr>
+        <w:ind w:left="1800" w:hanging="360"/>
+      </w:pPr>
+      <w:rPr>
+        <w:rFonts w:ascii="Wingdings" w:eastAsiaTheme="minorHAnsi" w:hAnsi="Wingdings" w:cstheme="minorBidi" w:hint="default"/>
+      </w:rPr>
+    </w:lvl>
+    <w:lvl w:ilvl="2" w:tentative="1">
+      <w:start w:val="1"/>
+      <w:numFmt w:val="decimal"/>
+      <w:lvlText w:val="%3."/>
+      <w:lvlJc w:val="left"/>
+      <w:pPr>
+        <w:tabs>
+          <w:tab w:val="num" w:pos="2520"/>
+        </w:tabs>
+        <w:ind w:left="2520" w:hanging="360"/>
+      </w:pPr>
+    </w:lvl>
+    <w:lvl w:ilvl="3" w:tentative="1">
+      <w:start w:val="1"/>
+      <w:numFmt w:val="decimal"/>
+      <w:lvlText w:val="%4."/>
+      <w:lvlJc w:val="left"/>
+      <w:pPr>
+        <w:tabs>
+          <w:tab w:val="num" w:pos="3240"/>
+        </w:tabs>
+        <w:ind w:left="3240" w:hanging="360"/>
+      </w:pPr>
+    </w:lvl>
+    <w:lvl w:ilvl="4" w:tentative="1">
+      <w:start w:val="1"/>
+      <w:numFmt w:val="decimal"/>
+      <w:lvlText w:val="%5."/>
+      <w:lvlJc w:val="left"/>
+      <w:pPr>
+        <w:tabs>
+          <w:tab w:val="num" w:pos="3960"/>
+        </w:tabs>
+        <w:ind w:left="3960" w:hanging="360"/>
+      </w:pPr>
+    </w:lvl>
+    <w:lvl w:ilvl="5" w:tentative="1">
+      <w:start w:val="1"/>
+      <w:numFmt w:val="decimal"/>
+      <w:lvlText w:val="%6."/>
+      <w:lvlJc w:val="left"/>
+      <w:pPr>
+        <w:tabs>
+          <w:tab w:val="num" w:pos="4680"/>
+        </w:tabs>
+        <w:ind w:left="4680" w:hanging="360"/>
+      </w:pPr>
+    </w:lvl>
+    <w:lvl w:ilvl="6" w:tentative="1">
+      <w:start w:val="1"/>
+      <w:numFmt w:val="decimal"/>
+      <w:lvlText w:val="%7."/>
+      <w:lvlJc w:val="left"/>
+      <w:pPr>
+        <w:tabs>
+          <w:tab w:val="num" w:pos="5400"/>
+        </w:tabs>
+        <w:ind w:left="5400" w:hanging="360"/>
+      </w:pPr>
+    </w:lvl>
+    <w:lvl w:ilvl="7" w:tentative="1">
+      <w:start w:val="1"/>
+      <w:numFmt w:val="decimal"/>
+      <w:lvlText w:val="%8."/>
+      <w:lvlJc w:val="left"/>
+      <w:pPr>
+        <w:tabs>
+          <w:tab w:val="num" w:pos="6120"/>
+        </w:tabs>
+        <w:ind w:left="6120" w:hanging="360"/>
+      </w:pPr>
+    </w:lvl>
+    <w:lvl w:ilvl="8" w:tentative="1">
+      <w:start w:val="1"/>
+      <w:numFmt w:val="decimal"/>
+      <w:lvlText w:val="%9."/>
+      <w:lvlJc w:val="left"/>
+      <w:pPr>
+        <w:tabs>
+          <w:tab w:val="num" w:pos="6840"/>
+        </w:tabs>
+        <w:ind w:left="6840" w:hanging="360"/>
+      </w:pPr>
+    </w:lvl>
+  </w:abstractNum>
+  <w:abstractNum w:abstractNumId="3" w15:restartNumberingAfterBreak="0">
+    <w:nsid w:val="668B27EA"/>
     <w:multiLevelType w:val="multilevel"/>
     <w:tmpl w:val="8FB237EE"/>
     <w:lvl w:ilvl="0">
@@ -928,6 +1529,12 @@
     <w:abstractNumId w:val="0"/>
   </w:num>
   <w:num w:numId="2" w16cid:durableId="670302338">
+    <w:abstractNumId w:val="2"/>
+  </w:num>
+  <w:num w:numId="3" w16cid:durableId="1984657156">
+    <w:abstractNumId w:val="3"/>
+  </w:num>
+  <w:num w:numId="4" w16cid:durableId="1076318268">
     <w:abstractNumId w:val="1"/>
   </w:num>
 </w:numbering>
@@ -1333,7 +1940,7 @@
   <w:style w:type="paragraph" w:default="1" w:styleId="Binhthng">
     <w:name w:val="Normal"/>
     <w:qFormat/>
-    <w:rsid w:val="00F80B85"/>
+    <w:rsid w:val="00C64EE1"/>
   </w:style>
   <w:style w:type="paragraph" w:styleId="u1">
     <w:name w:val="heading 1"/>
@@ -1537,6 +2144,7 @@
   <w:style w:type="character" w:default="1" w:styleId="Phngmcinhcuaoanvn">
     <w:name w:val="Default Paragraph Font"/>
     <w:uiPriority w:val="1"/>
+    <w:semiHidden/>
     <w:unhideWhenUsed/>
   </w:style>
   <w:style w:type="table" w:default="1" w:styleId="BangThngthng">

</xml_diff>